<commit_message>
version 0.0.25 creation of world facture
</commit_message>
<xml_diff>
--- a/apps/facture/static/facture/file_templates/file_input/Facture_template_World.docx
+++ b/apps/facture/static/facture/file_templates/file_input/Facture_template_World.docx
@@ -1,6 +1,6 @@
 
 <file path=word/document.xml><?xml version="1.0" encoding="utf-8"?>
-<w:document xmlns:wpc="http://schemas.microsoft.com/office/word/2010/wordprocessingCanvas" xmlns:cx="http://schemas.microsoft.com/office/drawing/2014/chartex" xmlns:cx1="http://schemas.microsoft.com/office/drawing/2015/9/8/chartex" xmlns:cx2="http://schemas.microsoft.com/office/drawing/2015/10/21/chartex" xmlns:cx3="http://schemas.microsoft.com/office/drawing/2016/5/9/chartex" xmlns:cx4="http://schemas.microsoft.com/office/drawing/2016/5/10/chartex" xmlns:cx5="http://schemas.microsoft.com/office/drawing/2016/5/11/chartex" xmlns:cx6="http://schemas.microsoft.com/office/drawing/2016/5/12/chartex" xmlns:cx7="http://schemas.microsoft.com/office/drawing/2016/5/13/chartex" xmlns:cx8="http://schemas.microsoft.com/office/drawing/2016/5/14/chartex" xmlns:mc="http://schemas.openxmlformats.org/markup-compatibility/2006" xmlns:aink="http://schemas.microsoft.com/office/drawing/2016/ink" xmlns:am3d="http://schemas.microsoft.com/office/drawing/2017/model3d" xmlns:o="urn:schemas-microsoft-com:office:office" xmlns:oel="http://schemas.microsoft.com/office/2019/extlst" xmlns:r="http://schemas.openxmlformats.org/officeDocument/2006/relationships" xmlns:m="http://schemas.openxmlformats.org/officeDocument/2006/math" xmlns:v="urn:schemas-microsoft-com:vml" xmlns:wp14="http://schemas.microsoft.com/office/word/2010/wordprocessingDrawing" xmlns:wp="http://schemas.openxmlformats.org/drawingml/2006/wordprocessingDrawing" xmlns:w10="urn:schemas-microsoft-com:office:word" xmlns:w="http://schemas.openxmlformats.org/wordprocessingml/2006/main" xmlns:w14="http://schemas.microsoft.com/office/word/2010/wordml" xmlns:w15="http://schemas.microsoft.com/office/word/2012/wordml" xmlns:w16cex="http://schemas.microsoft.com/office/word/2018/wordml/cex" xmlns:w16cid="http://schemas.microsoft.com/office/word/2016/wordml/cid" xmlns:w16="http://schemas.microsoft.com/office/word/2018/wordml" xmlns:w16sdtdh="http://schemas.microsoft.com/office/word/2020/wordml/sdtdatahash" xmlns:w16se="http://schemas.microsoft.com/office/word/2015/wordml/symex" xmlns:wpg="http://schemas.microsoft.com/office/word/2010/wordprocessingGroup" xmlns:wpi="http://schemas.microsoft.com/office/word/2010/wordprocessingInk" xmlns:wne="http://schemas.microsoft.com/office/word/2006/wordml" xmlns:wps="http://schemas.microsoft.com/office/word/2010/wordprocessingShape" mc:Ignorable="w14 w15 w16se w16cid w16 w16cex w16sdtdh wp14">
+<w:document xmlns:wpc="http://schemas.microsoft.com/office/word/2010/wordprocessingCanvas" xmlns:cx="http://schemas.microsoft.com/office/drawing/2014/chartex" xmlns:cx1="http://schemas.microsoft.com/office/drawing/2015/9/8/chartex" xmlns:cx2="http://schemas.microsoft.com/office/drawing/2015/10/21/chartex" xmlns:cx3="http://schemas.microsoft.com/office/drawing/2016/5/9/chartex" xmlns:cx4="http://schemas.microsoft.com/office/drawing/2016/5/10/chartex" xmlns:cx5="http://schemas.microsoft.com/office/drawing/2016/5/11/chartex" xmlns:cx6="http://schemas.microsoft.com/office/drawing/2016/5/12/chartex" xmlns:cx7="http://schemas.microsoft.com/office/drawing/2016/5/13/chartex" xmlns:cx8="http://schemas.microsoft.com/office/drawing/2016/5/14/chartex" xmlns:mc="http://schemas.openxmlformats.org/markup-compatibility/2006" xmlns:aink="http://schemas.microsoft.com/office/drawing/2016/ink" xmlns:am3d="http://schemas.microsoft.com/office/drawing/2017/model3d" xmlns:o="urn:schemas-microsoft-com:office:office" xmlns:oel="http://schemas.microsoft.com/office/2019/extlst" xmlns:r="http://schemas.openxmlformats.org/officeDocument/2006/relationships" xmlns:m="http://schemas.openxmlformats.org/officeDocument/2006/math" xmlns:v="urn:schemas-microsoft-com:vml" xmlns:wp14="http://schemas.microsoft.com/office/word/2010/wordprocessingDrawing" xmlns:wp="http://schemas.openxmlformats.org/drawingml/2006/wordprocessingDrawing" xmlns:w10="urn:schemas-microsoft-com:office:word" xmlns:w="http://schemas.openxmlformats.org/wordprocessingml/2006/main" xmlns:w14="http://schemas.microsoft.com/office/word/2010/wordml" xmlns:w15="http://schemas.microsoft.com/office/word/2012/wordml" xmlns:w16cex="http://schemas.microsoft.com/office/word/2018/wordml/cex" xmlns:w16cid="http://schemas.microsoft.com/office/word/2016/wordml/cid" xmlns:w16="http://schemas.microsoft.com/office/word/2018/wordml" xmlns:w16du="http://schemas.microsoft.com/office/word/2023/wordml/word16du" xmlns:w16sdtdh="http://schemas.microsoft.com/office/word/2020/wordml/sdtdatahash" xmlns:w16se="http://schemas.microsoft.com/office/word/2015/wordml/symex" xmlns:wpg="http://schemas.microsoft.com/office/word/2010/wordprocessingGroup" xmlns:wpi="http://schemas.microsoft.com/office/word/2010/wordprocessingInk" xmlns:wne="http://schemas.microsoft.com/office/word/2006/wordml" xmlns:wps="http://schemas.microsoft.com/office/word/2010/wordprocessingShape" mc:Ignorable="w14 w15 w16se w16cid w16 w16cex w16sdtdh w16du wp14">
   <w:body>
     <w:p>
       <w:pPr>
@@ -101,6 +101,20 @@
                 <w:sz w:val="18"/>
               </w:rPr>
             </w:pPr>
+            <w:r>
+              <w:rPr>
+                <w:rFonts w:ascii="Times New Roman" w:hAnsi="Times New Roman"/>
+                <w:sz w:val="18"/>
+              </w:rPr>
+              <w:t xml:space="preserve"> </w:t>
+            </w:r>
+            <w:r>
+              <w:rPr>
+                <w:spacing w:val="-2"/>
+                <w:sz w:val="20"/>
+              </w:rPr>
+              <w:t>receiver</w:t>
+            </w:r>
           </w:p>
         </w:tc>
       </w:tr>
@@ -907,15 +921,15 @@
               <w:ind w:left="11" w:right="2"/>
               <w:jc w:val="center"/>
             </w:pPr>
-            <w:proofErr w:type="spellStart"/>
             <w:r>
               <w:rPr>
-                <w:spacing w:val="-2"/>
+                <w:rFonts w:ascii="ArialMT" w:hAnsi="ArialMT"/>
+                <w:color w:val="000000"/>
+                <w:spacing w:val="-4"/>
                 <w:sz w:val="20"/>
               </w:rPr>
               <w:t>quantity_after_percent</w:t>
             </w:r>
-            <w:proofErr w:type="spellEnd"/>
           </w:p>
         </w:tc>
       </w:tr>
@@ -1150,7 +1164,7 @@
                 <w:spacing w:val="-4"/>
                 <w:sz w:val="20"/>
               </w:rPr>
-              <w:t>total_payment_after_tax</w:t>
+              <w:t>net_pay</w:t>
             </w:r>
             <w:proofErr w:type="spellEnd"/>
           </w:p>
@@ -1814,7 +1828,7 @@
 </file>
 
 <file path=word/endnotes.xml><?xml version="1.0" encoding="utf-8"?>
-<w:endnotes xmlns:wpc="http://schemas.microsoft.com/office/word/2010/wordprocessingCanvas" xmlns:cx="http://schemas.microsoft.com/office/drawing/2014/chartex" xmlns:cx1="http://schemas.microsoft.com/office/drawing/2015/9/8/chartex" xmlns:cx2="http://schemas.microsoft.com/office/drawing/2015/10/21/chartex" xmlns:cx3="http://schemas.microsoft.com/office/drawing/2016/5/9/chartex" xmlns:cx4="http://schemas.microsoft.com/office/drawing/2016/5/10/chartex" xmlns:cx5="http://schemas.microsoft.com/office/drawing/2016/5/11/chartex" xmlns:cx6="http://schemas.microsoft.com/office/drawing/2016/5/12/chartex" xmlns:cx7="http://schemas.microsoft.com/office/drawing/2016/5/13/chartex" xmlns:cx8="http://schemas.microsoft.com/office/drawing/2016/5/14/chartex" xmlns:mc="http://schemas.openxmlformats.org/markup-compatibility/2006" xmlns:aink="http://schemas.microsoft.com/office/drawing/2016/ink" xmlns:am3d="http://schemas.microsoft.com/office/drawing/2017/model3d" xmlns:o="urn:schemas-microsoft-com:office:office" xmlns:oel="http://schemas.microsoft.com/office/2019/extlst" xmlns:r="http://schemas.openxmlformats.org/officeDocument/2006/relationships" xmlns:m="http://schemas.openxmlformats.org/officeDocument/2006/math" xmlns:v="urn:schemas-microsoft-com:vml" xmlns:wp14="http://schemas.microsoft.com/office/word/2010/wordprocessingDrawing" xmlns:wp="http://schemas.openxmlformats.org/drawingml/2006/wordprocessingDrawing" xmlns:w10="urn:schemas-microsoft-com:office:word" xmlns:w="http://schemas.openxmlformats.org/wordprocessingml/2006/main" xmlns:w14="http://schemas.microsoft.com/office/word/2010/wordml" xmlns:w15="http://schemas.microsoft.com/office/word/2012/wordml" xmlns:w16cex="http://schemas.microsoft.com/office/word/2018/wordml/cex" xmlns:w16cid="http://schemas.microsoft.com/office/word/2016/wordml/cid" xmlns:w16="http://schemas.microsoft.com/office/word/2018/wordml" xmlns:w16sdtdh="http://schemas.microsoft.com/office/word/2020/wordml/sdtdatahash" xmlns:w16se="http://schemas.microsoft.com/office/word/2015/wordml/symex" xmlns:wpg="http://schemas.microsoft.com/office/word/2010/wordprocessingGroup" xmlns:wpi="http://schemas.microsoft.com/office/word/2010/wordprocessingInk" xmlns:wne="http://schemas.microsoft.com/office/word/2006/wordml" xmlns:wps="http://schemas.microsoft.com/office/word/2010/wordprocessingShape" mc:Ignorable="w14 w15 w16se w16cid w16 w16cex w16sdtdh wp14">
+<w:endnotes xmlns:wpc="http://schemas.microsoft.com/office/word/2010/wordprocessingCanvas" xmlns:cx="http://schemas.microsoft.com/office/drawing/2014/chartex" xmlns:cx1="http://schemas.microsoft.com/office/drawing/2015/9/8/chartex" xmlns:cx2="http://schemas.microsoft.com/office/drawing/2015/10/21/chartex" xmlns:cx3="http://schemas.microsoft.com/office/drawing/2016/5/9/chartex" xmlns:cx4="http://schemas.microsoft.com/office/drawing/2016/5/10/chartex" xmlns:cx5="http://schemas.microsoft.com/office/drawing/2016/5/11/chartex" xmlns:cx6="http://schemas.microsoft.com/office/drawing/2016/5/12/chartex" xmlns:cx7="http://schemas.microsoft.com/office/drawing/2016/5/13/chartex" xmlns:cx8="http://schemas.microsoft.com/office/drawing/2016/5/14/chartex" xmlns:mc="http://schemas.openxmlformats.org/markup-compatibility/2006" xmlns:aink="http://schemas.microsoft.com/office/drawing/2016/ink" xmlns:am3d="http://schemas.microsoft.com/office/drawing/2017/model3d" xmlns:o="urn:schemas-microsoft-com:office:office" xmlns:oel="http://schemas.microsoft.com/office/2019/extlst" xmlns:r="http://schemas.openxmlformats.org/officeDocument/2006/relationships" xmlns:m="http://schemas.openxmlformats.org/officeDocument/2006/math" xmlns:v="urn:schemas-microsoft-com:vml" xmlns:wp14="http://schemas.microsoft.com/office/word/2010/wordprocessingDrawing" xmlns:wp="http://schemas.openxmlformats.org/drawingml/2006/wordprocessingDrawing" xmlns:w10="urn:schemas-microsoft-com:office:word" xmlns:w="http://schemas.openxmlformats.org/wordprocessingml/2006/main" xmlns:w14="http://schemas.microsoft.com/office/word/2010/wordml" xmlns:w15="http://schemas.microsoft.com/office/word/2012/wordml" xmlns:w16cex="http://schemas.microsoft.com/office/word/2018/wordml/cex" xmlns:w16cid="http://schemas.microsoft.com/office/word/2016/wordml/cid" xmlns:w16="http://schemas.microsoft.com/office/word/2018/wordml" xmlns:w16du="http://schemas.microsoft.com/office/word/2023/wordml/word16du" xmlns:w16sdtdh="http://schemas.microsoft.com/office/word/2020/wordml/sdtdatahash" xmlns:w16se="http://schemas.microsoft.com/office/word/2015/wordml/symex" xmlns:wpg="http://schemas.microsoft.com/office/word/2010/wordprocessingGroup" xmlns:wpi="http://schemas.microsoft.com/office/word/2010/wordprocessingInk" xmlns:wne="http://schemas.microsoft.com/office/word/2006/wordml" xmlns:wps="http://schemas.microsoft.com/office/word/2010/wordprocessingShape" mc:Ignorable="w14 w15 w16se w16cid w16 w16cex w16sdtdh w16du wp14">
   <w:endnote w:type="separator" w:id="-1">
     <w:p>
       <w:r>
@@ -1833,7 +1847,7 @@
 </file>
 
 <file path=word/footer1.xml><?xml version="1.0" encoding="utf-8"?>
-<w:ftr xmlns:wpc="http://schemas.microsoft.com/office/word/2010/wordprocessingCanvas" xmlns:cx="http://schemas.microsoft.com/office/drawing/2014/chartex" xmlns:cx1="http://schemas.microsoft.com/office/drawing/2015/9/8/chartex" xmlns:cx2="http://schemas.microsoft.com/office/drawing/2015/10/21/chartex" xmlns:cx3="http://schemas.microsoft.com/office/drawing/2016/5/9/chartex" xmlns:cx4="http://schemas.microsoft.com/office/drawing/2016/5/10/chartex" xmlns:cx5="http://schemas.microsoft.com/office/drawing/2016/5/11/chartex" xmlns:cx6="http://schemas.microsoft.com/office/drawing/2016/5/12/chartex" xmlns:cx7="http://schemas.microsoft.com/office/drawing/2016/5/13/chartex" xmlns:cx8="http://schemas.microsoft.com/office/drawing/2016/5/14/chartex" xmlns:mc="http://schemas.openxmlformats.org/markup-compatibility/2006" xmlns:aink="http://schemas.microsoft.com/office/drawing/2016/ink" xmlns:am3d="http://schemas.microsoft.com/office/drawing/2017/model3d" xmlns:o="urn:schemas-microsoft-com:office:office" xmlns:oel="http://schemas.microsoft.com/office/2019/extlst" xmlns:r="http://schemas.openxmlformats.org/officeDocument/2006/relationships" xmlns:m="http://schemas.openxmlformats.org/officeDocument/2006/math" xmlns:v="urn:schemas-microsoft-com:vml" xmlns:wp14="http://schemas.microsoft.com/office/word/2010/wordprocessingDrawing" xmlns:wp="http://schemas.openxmlformats.org/drawingml/2006/wordprocessingDrawing" xmlns:w10="urn:schemas-microsoft-com:office:word" xmlns:w="http://schemas.openxmlformats.org/wordprocessingml/2006/main" xmlns:w14="http://schemas.microsoft.com/office/word/2010/wordml" xmlns:w15="http://schemas.microsoft.com/office/word/2012/wordml" xmlns:w16cex="http://schemas.microsoft.com/office/word/2018/wordml/cex" xmlns:w16cid="http://schemas.microsoft.com/office/word/2016/wordml/cid" xmlns:w16="http://schemas.microsoft.com/office/word/2018/wordml" xmlns:w16sdtdh="http://schemas.microsoft.com/office/word/2020/wordml/sdtdatahash" xmlns:w16se="http://schemas.microsoft.com/office/word/2015/wordml/symex" xmlns:wpg="http://schemas.microsoft.com/office/word/2010/wordprocessingGroup" xmlns:wpi="http://schemas.microsoft.com/office/word/2010/wordprocessingInk" xmlns:wne="http://schemas.microsoft.com/office/word/2006/wordml" xmlns:wps="http://schemas.microsoft.com/office/word/2010/wordprocessingShape" mc:Ignorable="w14 w15 w16se w16cid w16 w16cex w16sdtdh wp14">
+<w:ftr xmlns:wpc="http://schemas.microsoft.com/office/word/2010/wordprocessingCanvas" xmlns:cx="http://schemas.microsoft.com/office/drawing/2014/chartex" xmlns:cx1="http://schemas.microsoft.com/office/drawing/2015/9/8/chartex" xmlns:cx2="http://schemas.microsoft.com/office/drawing/2015/10/21/chartex" xmlns:cx3="http://schemas.microsoft.com/office/drawing/2016/5/9/chartex" xmlns:cx4="http://schemas.microsoft.com/office/drawing/2016/5/10/chartex" xmlns:cx5="http://schemas.microsoft.com/office/drawing/2016/5/11/chartex" xmlns:cx6="http://schemas.microsoft.com/office/drawing/2016/5/12/chartex" xmlns:cx7="http://schemas.microsoft.com/office/drawing/2016/5/13/chartex" xmlns:cx8="http://schemas.microsoft.com/office/drawing/2016/5/14/chartex" xmlns:mc="http://schemas.openxmlformats.org/markup-compatibility/2006" xmlns:aink="http://schemas.microsoft.com/office/drawing/2016/ink" xmlns:am3d="http://schemas.microsoft.com/office/drawing/2017/model3d" xmlns:o="urn:schemas-microsoft-com:office:office" xmlns:oel="http://schemas.microsoft.com/office/2019/extlst" xmlns:r="http://schemas.openxmlformats.org/officeDocument/2006/relationships" xmlns:m="http://schemas.openxmlformats.org/officeDocument/2006/math" xmlns:v="urn:schemas-microsoft-com:vml" xmlns:wp14="http://schemas.microsoft.com/office/word/2010/wordprocessingDrawing" xmlns:wp="http://schemas.openxmlformats.org/drawingml/2006/wordprocessingDrawing" xmlns:w10="urn:schemas-microsoft-com:office:word" xmlns:w="http://schemas.openxmlformats.org/wordprocessingml/2006/main" xmlns:w14="http://schemas.microsoft.com/office/word/2010/wordml" xmlns:w15="http://schemas.microsoft.com/office/word/2012/wordml" xmlns:w16cex="http://schemas.microsoft.com/office/word/2018/wordml/cex" xmlns:w16cid="http://schemas.microsoft.com/office/word/2016/wordml/cid" xmlns:w16="http://schemas.microsoft.com/office/word/2018/wordml" xmlns:w16du="http://schemas.microsoft.com/office/word/2023/wordml/word16du" xmlns:w16sdtdh="http://schemas.microsoft.com/office/word/2020/wordml/sdtdatahash" xmlns:w16se="http://schemas.microsoft.com/office/word/2015/wordml/symex" xmlns:wpg="http://schemas.microsoft.com/office/word/2010/wordprocessingGroup" xmlns:wpi="http://schemas.microsoft.com/office/word/2010/wordprocessingInk" xmlns:wne="http://schemas.microsoft.com/office/word/2006/wordml" xmlns:wps="http://schemas.microsoft.com/office/word/2010/wordprocessingShape" mc:Ignorable="w14 w15 w16se w16cid w16 w16cex w16sdtdh w16du wp14">
   <w:p>
     <w:pPr>
       <w:pStyle w:val="BodyText"/>
@@ -2737,7 +2751,7 @@
 </file>
 
 <file path=word/footnotes.xml><?xml version="1.0" encoding="utf-8"?>
-<w:footnotes xmlns:wpc="http://schemas.microsoft.com/office/word/2010/wordprocessingCanvas" xmlns:cx="http://schemas.microsoft.com/office/drawing/2014/chartex" xmlns:cx1="http://schemas.microsoft.com/office/drawing/2015/9/8/chartex" xmlns:cx2="http://schemas.microsoft.com/office/drawing/2015/10/21/chartex" xmlns:cx3="http://schemas.microsoft.com/office/drawing/2016/5/9/chartex" xmlns:cx4="http://schemas.microsoft.com/office/drawing/2016/5/10/chartex" xmlns:cx5="http://schemas.microsoft.com/office/drawing/2016/5/11/chartex" xmlns:cx6="http://schemas.microsoft.com/office/drawing/2016/5/12/chartex" xmlns:cx7="http://schemas.microsoft.com/office/drawing/2016/5/13/chartex" xmlns:cx8="http://schemas.microsoft.com/office/drawing/2016/5/14/chartex" xmlns:mc="http://schemas.openxmlformats.org/markup-compatibility/2006" xmlns:aink="http://schemas.microsoft.com/office/drawing/2016/ink" xmlns:am3d="http://schemas.microsoft.com/office/drawing/2017/model3d" xmlns:o="urn:schemas-microsoft-com:office:office" xmlns:oel="http://schemas.microsoft.com/office/2019/extlst" xmlns:r="http://schemas.openxmlformats.org/officeDocument/2006/relationships" xmlns:m="http://schemas.openxmlformats.org/officeDocument/2006/math" xmlns:v="urn:schemas-microsoft-com:vml" xmlns:wp14="http://schemas.microsoft.com/office/word/2010/wordprocessingDrawing" xmlns:wp="http://schemas.openxmlformats.org/drawingml/2006/wordprocessingDrawing" xmlns:w10="urn:schemas-microsoft-com:office:word" xmlns:w="http://schemas.openxmlformats.org/wordprocessingml/2006/main" xmlns:w14="http://schemas.microsoft.com/office/word/2010/wordml" xmlns:w15="http://schemas.microsoft.com/office/word/2012/wordml" xmlns:w16cex="http://schemas.microsoft.com/office/word/2018/wordml/cex" xmlns:w16cid="http://schemas.microsoft.com/office/word/2016/wordml/cid" xmlns:w16="http://schemas.microsoft.com/office/word/2018/wordml" xmlns:w16sdtdh="http://schemas.microsoft.com/office/word/2020/wordml/sdtdatahash" xmlns:w16se="http://schemas.microsoft.com/office/word/2015/wordml/symex" xmlns:wpg="http://schemas.microsoft.com/office/word/2010/wordprocessingGroup" xmlns:wpi="http://schemas.microsoft.com/office/word/2010/wordprocessingInk" xmlns:wne="http://schemas.microsoft.com/office/word/2006/wordml" xmlns:wps="http://schemas.microsoft.com/office/word/2010/wordprocessingShape" mc:Ignorable="w14 w15 w16se w16cid w16 w16cex w16sdtdh wp14">
+<w:footnotes xmlns:wpc="http://schemas.microsoft.com/office/word/2010/wordprocessingCanvas" xmlns:cx="http://schemas.microsoft.com/office/drawing/2014/chartex" xmlns:cx1="http://schemas.microsoft.com/office/drawing/2015/9/8/chartex" xmlns:cx2="http://schemas.microsoft.com/office/drawing/2015/10/21/chartex" xmlns:cx3="http://schemas.microsoft.com/office/drawing/2016/5/9/chartex" xmlns:cx4="http://schemas.microsoft.com/office/drawing/2016/5/10/chartex" xmlns:cx5="http://schemas.microsoft.com/office/drawing/2016/5/11/chartex" xmlns:cx6="http://schemas.microsoft.com/office/drawing/2016/5/12/chartex" xmlns:cx7="http://schemas.microsoft.com/office/drawing/2016/5/13/chartex" xmlns:cx8="http://schemas.microsoft.com/office/drawing/2016/5/14/chartex" xmlns:mc="http://schemas.openxmlformats.org/markup-compatibility/2006" xmlns:aink="http://schemas.microsoft.com/office/drawing/2016/ink" xmlns:am3d="http://schemas.microsoft.com/office/drawing/2017/model3d" xmlns:o="urn:schemas-microsoft-com:office:office" xmlns:oel="http://schemas.microsoft.com/office/2019/extlst" xmlns:r="http://schemas.openxmlformats.org/officeDocument/2006/relationships" xmlns:m="http://schemas.openxmlformats.org/officeDocument/2006/math" xmlns:v="urn:schemas-microsoft-com:vml" xmlns:wp14="http://schemas.microsoft.com/office/word/2010/wordprocessingDrawing" xmlns:wp="http://schemas.openxmlformats.org/drawingml/2006/wordprocessingDrawing" xmlns:w10="urn:schemas-microsoft-com:office:word" xmlns:w="http://schemas.openxmlformats.org/wordprocessingml/2006/main" xmlns:w14="http://schemas.microsoft.com/office/word/2010/wordml" xmlns:w15="http://schemas.microsoft.com/office/word/2012/wordml" xmlns:w16cex="http://schemas.microsoft.com/office/word/2018/wordml/cex" xmlns:w16cid="http://schemas.microsoft.com/office/word/2016/wordml/cid" xmlns:w16="http://schemas.microsoft.com/office/word/2018/wordml" xmlns:w16du="http://schemas.microsoft.com/office/word/2023/wordml/word16du" xmlns:w16sdtdh="http://schemas.microsoft.com/office/word/2020/wordml/sdtdatahash" xmlns:w16se="http://schemas.microsoft.com/office/word/2015/wordml/symex" xmlns:wpg="http://schemas.microsoft.com/office/word/2010/wordprocessingGroup" xmlns:wpi="http://schemas.microsoft.com/office/word/2010/wordprocessingInk" xmlns:wne="http://schemas.microsoft.com/office/word/2006/wordml" xmlns:wps="http://schemas.microsoft.com/office/word/2010/wordprocessingShape" mc:Ignorable="w14 w15 w16se w16cid w16 w16cex w16sdtdh w16du wp14">
   <w:footnote w:type="separator" w:id="-1">
     <w:p>
       <w:r>
@@ -2756,7 +2770,7 @@
 </file>
 
 <file path=word/header1.xml><?xml version="1.0" encoding="utf-8"?>
-<w:hdr xmlns:wpc="http://schemas.microsoft.com/office/word/2010/wordprocessingCanvas" xmlns:cx="http://schemas.microsoft.com/office/drawing/2014/chartex" xmlns:cx1="http://schemas.microsoft.com/office/drawing/2015/9/8/chartex" xmlns:cx2="http://schemas.microsoft.com/office/drawing/2015/10/21/chartex" xmlns:cx3="http://schemas.microsoft.com/office/drawing/2016/5/9/chartex" xmlns:cx4="http://schemas.microsoft.com/office/drawing/2016/5/10/chartex" xmlns:cx5="http://schemas.microsoft.com/office/drawing/2016/5/11/chartex" xmlns:cx6="http://schemas.microsoft.com/office/drawing/2016/5/12/chartex" xmlns:cx7="http://schemas.microsoft.com/office/drawing/2016/5/13/chartex" xmlns:cx8="http://schemas.microsoft.com/office/drawing/2016/5/14/chartex" xmlns:mc="http://schemas.openxmlformats.org/markup-compatibility/2006" xmlns:aink="http://schemas.microsoft.com/office/drawing/2016/ink" xmlns:am3d="http://schemas.microsoft.com/office/drawing/2017/model3d" xmlns:o="urn:schemas-microsoft-com:office:office" xmlns:oel="http://schemas.microsoft.com/office/2019/extlst" xmlns:r="http://schemas.openxmlformats.org/officeDocument/2006/relationships" xmlns:m="http://schemas.openxmlformats.org/officeDocument/2006/math" xmlns:v="urn:schemas-microsoft-com:vml" xmlns:wp14="http://schemas.microsoft.com/office/word/2010/wordprocessingDrawing" xmlns:wp="http://schemas.openxmlformats.org/drawingml/2006/wordprocessingDrawing" xmlns:w10="urn:schemas-microsoft-com:office:word" xmlns:w="http://schemas.openxmlformats.org/wordprocessingml/2006/main" xmlns:w14="http://schemas.microsoft.com/office/word/2010/wordml" xmlns:w15="http://schemas.microsoft.com/office/word/2012/wordml" xmlns:w16cex="http://schemas.microsoft.com/office/word/2018/wordml/cex" xmlns:w16cid="http://schemas.microsoft.com/office/word/2016/wordml/cid" xmlns:w16="http://schemas.microsoft.com/office/word/2018/wordml" xmlns:w16sdtdh="http://schemas.microsoft.com/office/word/2020/wordml/sdtdatahash" xmlns:w16se="http://schemas.microsoft.com/office/word/2015/wordml/symex" xmlns:wpg="http://schemas.microsoft.com/office/word/2010/wordprocessingGroup" xmlns:wpi="http://schemas.microsoft.com/office/word/2010/wordprocessingInk" xmlns:wne="http://schemas.microsoft.com/office/word/2006/wordml" xmlns:wps="http://schemas.microsoft.com/office/word/2010/wordprocessingShape" mc:Ignorable="w14 w15 w16se w16cid w16 w16cex w16sdtdh wp14">
+<w:hdr xmlns:wpc="http://schemas.microsoft.com/office/word/2010/wordprocessingCanvas" xmlns:cx="http://schemas.microsoft.com/office/drawing/2014/chartex" xmlns:cx1="http://schemas.microsoft.com/office/drawing/2015/9/8/chartex" xmlns:cx2="http://schemas.microsoft.com/office/drawing/2015/10/21/chartex" xmlns:cx3="http://schemas.microsoft.com/office/drawing/2016/5/9/chartex" xmlns:cx4="http://schemas.microsoft.com/office/drawing/2016/5/10/chartex" xmlns:cx5="http://schemas.microsoft.com/office/drawing/2016/5/11/chartex" xmlns:cx6="http://schemas.microsoft.com/office/drawing/2016/5/12/chartex" xmlns:cx7="http://schemas.microsoft.com/office/drawing/2016/5/13/chartex" xmlns:cx8="http://schemas.microsoft.com/office/drawing/2016/5/14/chartex" xmlns:mc="http://schemas.openxmlformats.org/markup-compatibility/2006" xmlns:aink="http://schemas.microsoft.com/office/drawing/2016/ink" xmlns:am3d="http://schemas.microsoft.com/office/drawing/2017/model3d" xmlns:o="urn:schemas-microsoft-com:office:office" xmlns:oel="http://schemas.microsoft.com/office/2019/extlst" xmlns:r="http://schemas.openxmlformats.org/officeDocument/2006/relationships" xmlns:m="http://schemas.openxmlformats.org/officeDocument/2006/math" xmlns:v="urn:schemas-microsoft-com:vml" xmlns:wp14="http://schemas.microsoft.com/office/word/2010/wordprocessingDrawing" xmlns:wp="http://schemas.openxmlformats.org/drawingml/2006/wordprocessingDrawing" xmlns:w10="urn:schemas-microsoft-com:office:word" xmlns:w="http://schemas.openxmlformats.org/wordprocessingml/2006/main" xmlns:w14="http://schemas.microsoft.com/office/word/2010/wordml" xmlns:w15="http://schemas.microsoft.com/office/word/2012/wordml" xmlns:w16cex="http://schemas.microsoft.com/office/word/2018/wordml/cex" xmlns:w16cid="http://schemas.microsoft.com/office/word/2016/wordml/cid" xmlns:w16="http://schemas.microsoft.com/office/word/2018/wordml" xmlns:w16du="http://schemas.microsoft.com/office/word/2023/wordml/word16du" xmlns:w16sdtdh="http://schemas.microsoft.com/office/word/2020/wordml/sdtdatahash" xmlns:w16se="http://schemas.microsoft.com/office/word/2015/wordml/symex" xmlns:wpg="http://schemas.microsoft.com/office/word/2010/wordprocessingGroup" xmlns:wpi="http://schemas.microsoft.com/office/word/2010/wordprocessingInk" xmlns:wne="http://schemas.microsoft.com/office/word/2006/wordml" xmlns:wps="http://schemas.microsoft.com/office/word/2010/wordprocessingShape" mc:Ignorable="w14 w15 w16se w16cid w16 w16cex w16sdtdh w16du wp14">
   <w:p>
     <w:pPr>
       <w:pStyle w:val="BodyText"/>
@@ -5207,7 +5221,7 @@
 </file>
 
 <file path=word/styles.xml><?xml version="1.0" encoding="utf-8"?>
-<w:styles xmlns:mc="http://schemas.openxmlformats.org/markup-compatibility/2006" xmlns:r="http://schemas.openxmlformats.org/officeDocument/2006/relationships" xmlns:w="http://schemas.openxmlformats.org/wordprocessingml/2006/main" xmlns:w14="http://schemas.microsoft.com/office/word/2010/wordml" xmlns:w15="http://schemas.microsoft.com/office/word/2012/wordml" xmlns:w16cex="http://schemas.microsoft.com/office/word/2018/wordml/cex" xmlns:w16cid="http://schemas.microsoft.com/office/word/2016/wordml/cid" xmlns:w16="http://schemas.microsoft.com/office/word/2018/wordml" xmlns:w16sdtdh="http://schemas.microsoft.com/office/word/2020/wordml/sdtdatahash" xmlns:w16se="http://schemas.microsoft.com/office/word/2015/wordml/symex" mc:Ignorable="w14 w15 w16se w16cid w16 w16cex w16sdtdh">
+<w:styles xmlns:mc="http://schemas.openxmlformats.org/markup-compatibility/2006" xmlns:r="http://schemas.openxmlformats.org/officeDocument/2006/relationships" xmlns:w="http://schemas.openxmlformats.org/wordprocessingml/2006/main" xmlns:w14="http://schemas.microsoft.com/office/word/2010/wordml" xmlns:w15="http://schemas.microsoft.com/office/word/2012/wordml" xmlns:w16cex="http://schemas.microsoft.com/office/word/2018/wordml/cex" xmlns:w16cid="http://schemas.microsoft.com/office/word/2016/wordml/cid" xmlns:w16="http://schemas.microsoft.com/office/word/2018/wordml" xmlns:w16du="http://schemas.microsoft.com/office/word/2023/wordml/word16du" xmlns:w16sdtdh="http://schemas.microsoft.com/office/word/2020/wordml/sdtdatahash" xmlns:w16se="http://schemas.microsoft.com/office/word/2015/wordml/symex" mc:Ignorable="w14 w15 w16se w16cid w16 w16cex w16sdtdh w16du">
   <w:docDefaults>
     <w:rPrDefault>
       <w:rPr>

</xml_diff>

<commit_message>
version 0.0.27 exporting world facture editing/deleting
</commit_message>
<xml_diff>
--- a/apps/facture/static/facture/file_templates/file_input/Facture_template_World.docx
+++ b/apps/facture/static/facture/file_templates/file_input/Facture_template_World.docx
@@ -454,16 +454,14 @@
                 <w:sz w:val="20"/>
               </w:rPr>
             </w:pPr>
-            <w:proofErr w:type="spellStart"/>
             <w:r>
               <w:rPr>
                 <w:b/>
                 <w:spacing w:val="-5"/>
                 <w:sz w:val="20"/>
               </w:rPr>
-              <w:t>sku</w:t>
+              <w:t>SKU</w:t>
             </w:r>
-            <w:proofErr w:type="spellEnd"/>
           </w:p>
         </w:tc>
         <w:tc>
@@ -748,9 +746,11 @@
               <w:ind w:left="20" w:right="2"/>
               <w:jc w:val="center"/>
             </w:pPr>
+            <w:proofErr w:type="spellStart"/>
             <w:r>
-              <w:t>reference</w:t>
+              <w:t>sku</w:t>
             </w:r>
+            <w:proofErr w:type="spellEnd"/>
           </w:p>
         </w:tc>
         <w:tc>
@@ -781,7 +781,7 @@
               <w:jc w:val="center"/>
             </w:pPr>
             <w:r>
-              <w:t>destination</w:t>
+              <w:t>description</w:t>
             </w:r>
           </w:p>
         </w:tc>
@@ -820,7 +820,7 @@
               <w:t xml:space="preserve">         </w:t>
             </w:r>
             <w:r>
-              <w:t>reference</w:t>
+              <w:t>specification</w:t>
             </w:r>
           </w:p>
         </w:tc>
@@ -921,6 +921,7 @@
               <w:ind w:left="11" w:right="2"/>
               <w:jc w:val="center"/>
             </w:pPr>
+            <w:proofErr w:type="spellStart"/>
             <w:r>
               <w:rPr>
                 <w:rFonts w:ascii="ArialMT" w:hAnsi="ArialMT"/>
@@ -930,6 +931,7 @@
               </w:rPr>
               <w:t>quantity_after_percent</w:t>
             </w:r>
+            <w:proofErr w:type="spellEnd"/>
           </w:p>
         </w:tc>
       </w:tr>

</xml_diff>